<commit_message>
feat: add note field to date print export functionality and update templates
</commit_message>
<xml_diff>
--- a/backend/templates/date-coding-work-order-template/date-coding-work-order-template.docx
+++ b/backend/templates/date-coding-work-order-template/date-coding-work-order-template.docx
@@ -466,8 +466,51 @@
       <w:pPr>
         <w:rPr>
           <w:rFonts w:ascii="Times New Roman" w:hAnsi="Times New Roman" w:cs="Times New Roman"/>
+          <w:b/>
+          <w:bCs/>
         </w:rPr>
       </w:pPr>
+    </w:p>
+    <w:p>
+      <w:pPr>
+        <w:rPr>
+          <w:rFonts w:ascii="Times New Roman" w:hAnsi="Times New Roman" w:cs="Times New Roman"/>
+        </w:rPr>
+      </w:pPr>
+      <w:r>
+        <w:rPr>
+          <w:rFonts w:ascii="Times New Roman" w:hAnsi="Times New Roman" w:cs="Times New Roman"/>
+          <w:b/>
+          <w:bCs/>
+        </w:rPr>
+        <w:t>Ghi chú( Nếu có)</w:t>
+      </w:r>
+      <w:r>
+        <w:rPr>
+          <w:rFonts w:ascii="Times New Roman" w:hAnsi="Times New Roman" w:cs="Times New Roman"/>
+          <w:b/>
+          <w:bCs/>
+        </w:rPr>
+        <w:t xml:space="preserve">: </w:t>
+      </w:r>
+      <w:r>
+        <w:rPr>
+          <w:rFonts w:ascii="Times New Roman" w:hAnsi="Times New Roman" w:cs="Times New Roman"/>
+        </w:rPr>
+        <w:t>{{</w:t>
+      </w:r>
+      <w:r>
+        <w:rPr>
+          <w:rFonts w:ascii="Times New Roman" w:hAnsi="Times New Roman" w:cs="Times New Roman"/>
+        </w:rPr>
+        <w:t>note</w:t>
+      </w:r>
+      <w:r>
+        <w:rPr>
+          <w:rFonts w:ascii="Times New Roman" w:hAnsi="Times New Roman" w:cs="Times New Roman"/>
+        </w:rPr>
+        <w:t>}}</w:t>
+      </w:r>
     </w:p>
     <w:p>
       <w:pPr>
@@ -536,7 +579,7 @@
       </w:tblGrid>
       <w:tr>
         <w:trPr>
-          <w:trHeight w:val="6497"/>
+          <w:trHeight w:val="5867"/>
         </w:trPr>
         <w:tc>
           <w:tcPr>

</xml_diff>